<commit_message>
docs: add CU00 sequence diagram source with Django sessions (#42)
</commit_message>
<xml_diff>
--- a/Anexos/Diseño/Plantilla de C.U 00.docx
+++ b/Anexos/Diseño/Plantilla de C.U 00.docx
@@ -440,7 +440,7 @@
                 <w:color w:val="1f1f1f"/>
                 <w:rtl w:val="0"/>
               </w:rPr>
-              <w:t xml:space="preserve">Permite a los usuarios registrados ingresar sus credenciales (correo/RUT y contraseña) en el Dashboard Web para obtener acceso seguro según su rol asignado.</w:t>
+              <w:t xml:space="preserve">Permite a los usuarios registrados ingresar sus credenciales (correo/RUT y contraseña) en la app web para obtener acceso seguro según su rol asignado.</w:t>
             </w:r>
             <w:r>
               <w:rPr>
@@ -640,7 +640,7 @@
                 <w:color w:val="1f1f1f"/>
                 <w:rtl w:val="0"/>
               </w:rPr>
-              <w:t xml:space="preserve">El usuario navega a la URL del Dashboard Web.</w:t>
+              <w:t xml:space="preserve">El usuario navega a la URL de la app web.</w:t>
             </w:r>
           </w:p>
           <w:p>
@@ -724,7 +724,7 @@
                 <w:color w:val="1f1f1f"/>
                 <w:rtl w:val="0"/>
               </w:rPr>
-              <w:t xml:space="preserve">El sistema genera un token de sesión seguro (JWT) codificando el Rol del usuario.</w:t>
+              <w:t xml:space="preserve">El sistema abre una sesión segura vinculada al usuario y su rol.</w:t>
             </w:r>
           </w:p>
           <w:p>
@@ -746,7 +746,7 @@
                 <w:color w:val="1f1f1f"/>
                 <w:rtl w:val="0"/>
               </w:rPr>
-              <w:t xml:space="preserve">El sistema redirige al usuario a la vista principal correspondiente a su rol (Reponedor → Vista de Alertas; Jefe de Salón → Dashboard de Métricas; Admin → Panel Global).</w:t>
+              <w:t xml:space="preserve">El sistema redirige al usuario a la vista principal correspondiente a su rol (Reponedor → Alertas; Jefe de Salón → Análisis, hasta que exista el dashboard (CU03); Administrador → Gestión de usuarios, hasta que exista un panel global).</w:t>
             </w:r>
           </w:p>
         </w:tc>
@@ -868,7 +868,7 @@
                 <w:color w:val="1f1f1f"/>
                 <w:rtl w:val="0"/>
               </w:rPr>
-              <w:t xml:space="preserve"> y bloquea la cuenta tras 5 intentos fallidos consecutivos.</w:t>
+              <w:t xml:space="preserve"> y bloquea la cuenta tras 5 intentos fallidos consecutivos: la cuenta queda inactiva y solo el Administrador la reactiva (CU06).</w:t>
             </w:r>
             <w:r>
               <w:rPr>

</xml_diff>